<commit_message>
added from batch file
</commit_message>
<xml_diff>
--- a/delete/Johnny_Abou_Haidar_2024_08.docx
+++ b/delete/Johnny_Abou_Haidar_2024_08.docx
@@ -107,17 +107,8 @@
                 <w:sz w:val="18"/>
                 <w:szCs w:val="18"/>
               </w:rPr>
-              <w:t>github.com/</w:t>
-            </w:r>
-            <w:proofErr w:type="spellStart"/>
-            <w:r>
-              <w:rPr>
-                <w:sz w:val="18"/>
-                <w:szCs w:val="18"/>
-              </w:rPr>
-              <w:t>johnnyabouhaidar</w:t>
-            </w:r>
-            <w:proofErr w:type="spellEnd"/>
+              <w:t>github.com/johnnyabouhaidar</w:t>
+            </w:r>
             <w:r>
               <w:rPr>
                 <w:sz w:val="18"/>
@@ -411,55 +402,14 @@
                 <w:sz w:val="16"/>
                 <w:szCs w:val="16"/>
               </w:rPr>
-              <w:t xml:space="preserve"> with 3rd party OCR tools and image classification services(</w:t>
-            </w:r>
-            <w:proofErr w:type="spellStart"/>
-            <w:r>
-              <w:rPr>
-                <w:sz w:val="16"/>
-                <w:szCs w:val="16"/>
-              </w:rPr>
-              <w:t>Abbyy</w:t>
-            </w:r>
-            <w:proofErr w:type="spellEnd"/>
-            <w:r>
-              <w:rPr>
-                <w:sz w:val="16"/>
-                <w:szCs w:val="16"/>
-              </w:rPr>
-              <w:t xml:space="preserve"> </w:t>
-            </w:r>
-            <w:proofErr w:type="spellStart"/>
-            <w:r>
-              <w:rPr>
-                <w:sz w:val="16"/>
-                <w:szCs w:val="16"/>
-              </w:rPr>
-              <w:t>Flexicapture</w:t>
-            </w:r>
-            <w:proofErr w:type="spellEnd"/>
-            <w:r>
-              <w:rPr>
-                <w:sz w:val="16"/>
-                <w:szCs w:val="16"/>
-              </w:rPr>
-              <w:t xml:space="preserve"> and </w:t>
-            </w:r>
-            <w:proofErr w:type="spellStart"/>
-            <w:r>
-              <w:rPr>
-                <w:sz w:val="16"/>
-                <w:szCs w:val="16"/>
-              </w:rPr>
-              <w:t>Tensorflow</w:t>
-            </w:r>
-            <w:proofErr w:type="spellEnd"/>
-            <w:r>
-              <w:rPr>
-                <w:sz w:val="16"/>
-                <w:szCs w:val="16"/>
-              </w:rPr>
-              <w:t>)</w:t>
+              <w:t xml:space="preserve"> with 3rd party OCR tools and image classification services(Abbyy Flexicapture and </w:t>
+            </w:r>
+            <w:r>
+              <w:rPr>
+                <w:sz w:val="16"/>
+                <w:szCs w:val="16"/>
+              </w:rPr>
+              <w:t>Tensorflow)</w:t>
             </w:r>
           </w:p>
           <w:p>
@@ -529,23 +479,7 @@
                 <w:sz w:val="16"/>
                 <w:szCs w:val="16"/>
               </w:rPr>
-              <w:t xml:space="preserve">Web services development using ASP.NET Core Web API, and Python </w:t>
-            </w:r>
-            <w:proofErr w:type="spellStart"/>
-            <w:r>
-              <w:rPr>
-                <w:sz w:val="16"/>
-                <w:szCs w:val="16"/>
-              </w:rPr>
-              <w:t>FastAPI</w:t>
-            </w:r>
-            <w:proofErr w:type="spellEnd"/>
-            <w:r>
-              <w:rPr>
-                <w:sz w:val="16"/>
-                <w:szCs w:val="16"/>
-              </w:rPr>
-              <w:t xml:space="preserve">. </w:t>
+              <w:t xml:space="preserve">Web services development using ASP.NET Core Web API, and Python FastAPI. </w:t>
             </w:r>
           </w:p>
           <w:p>
@@ -567,17 +501,8 @@
                 <w:sz w:val="16"/>
                 <w:szCs w:val="16"/>
               </w:rPr>
-              <w:t xml:space="preserve"> Sense + </w:t>
-            </w:r>
-            <w:proofErr w:type="spellStart"/>
-            <w:r>
-              <w:rPr>
-                <w:sz w:val="16"/>
-                <w:szCs w:val="16"/>
-              </w:rPr>
-              <w:t>Nprinting</w:t>
-            </w:r>
-            <w:proofErr w:type="spellEnd"/>
+              <w:t xml:space="preserve"> Sense + Nprinting</w:t>
+            </w:r>
             <w:r>
               <w:rPr>
                 <w:sz w:val="16"/>
@@ -605,7 +530,21 @@
                 <w:sz w:val="16"/>
                 <w:szCs w:val="16"/>
               </w:rPr>
-              <w:t>-Involvement in automated QA activities using Katalon.</w:t>
+              <w:t>-Involvement in automated QA activities using Katalon</w:t>
+            </w:r>
+            <w:r>
+              <w:rPr>
+                <w:sz w:val="16"/>
+                <w:szCs w:val="16"/>
+              </w:rPr>
+              <w:t>, Selenium, UiPath,…</w:t>
+            </w:r>
+            <w:r>
+              <w:rPr>
+                <w:sz w:val="16"/>
+                <w:szCs w:val="16"/>
+              </w:rPr>
+              <w:t>.</w:t>
             </w:r>
           </w:p>
         </w:tc>
@@ -752,29 +691,11 @@
             <w:pPr>
               <w:pStyle w:val="Heading3"/>
             </w:pPr>
-            <w:proofErr w:type="spellStart"/>
-            <w:r>
-              <w:t>Watstelecom</w:t>
-            </w:r>
-            <w:proofErr w:type="spellEnd"/>
-            <w:r>
-              <w:t xml:space="preserve"> </w:t>
-            </w:r>
-            <w:proofErr w:type="spellStart"/>
-            <w:r>
-              <w:t>sarl</w:t>
-            </w:r>
-            <w:proofErr w:type="spellEnd"/>
-            <w:r>
-              <w:t xml:space="preserve"> | </w:t>
-            </w:r>
-            <w:proofErr w:type="spellStart"/>
-            <w:r>
-              <w:t>Bauchrieh</w:t>
-            </w:r>
-            <w:proofErr w:type="spellEnd"/>
-            <w:r>
-              <w:t>, Lebanon</w:t>
+            <w:r>
+              <w:t>Watstelecom sarl</w:t>
+            </w:r>
+            <w:r>
+              <w:t xml:space="preserve"> | Bauchrieh, Lebanon</w:t>
             </w:r>
           </w:p>
           <w:p>
@@ -1109,21 +1030,12 @@
                 <w:szCs w:val="16"/>
               </w:rPr>
             </w:pPr>
-            <w:proofErr w:type="spellStart"/>
-            <w:r>
-              <w:rPr>
-                <w:sz w:val="16"/>
-                <w:szCs w:val="16"/>
-              </w:rPr>
-              <w:t>Python,C#,SQL</w:t>
-            </w:r>
-            <w:proofErr w:type="spellEnd"/>
-            <w:r>
-              <w:rPr>
-                <w:sz w:val="16"/>
-                <w:szCs w:val="16"/>
-              </w:rPr>
-              <w:t>,…</w:t>
+            <w:r>
+              <w:rPr>
+                <w:sz w:val="16"/>
+                <w:szCs w:val="16"/>
+              </w:rPr>
+              <w:t>Python,C#,SQL,…</w:t>
             </w:r>
           </w:p>
           <w:p>
@@ -2783,6 +2695,13 @@
     <w:pitch w:val="variable"/>
     <w:sig w:usb0="20000287" w:usb1="00000003" w:usb2="00000000" w:usb3="00000000" w:csb0="0000019F" w:csb1="00000000"/>
   </w:font>
+  <w:font w:name="Arial">
+    <w:panose1 w:val="020B0604020202020204"/>
+    <w:charset w:val="00"/>
+    <w:family w:val="swiss"/>
+    <w:pitch w:val="variable"/>
+    <w:sig w:usb0="E0002EFF" w:usb1="C000785B" w:usb2="00000009" w:usb3="00000000" w:csb0="000001FF" w:csb1="00000000"/>
+  </w:font>
   <w:font w:name="Aptos Display">
     <w:charset w:val="00"/>
     <w:family w:val="swiss"/>
@@ -2816,6 +2735,7 @@
     <w:rsid w:val="0070369C"/>
     <w:rsid w:val="0081564E"/>
     <w:rsid w:val="00832458"/>
+    <w:rsid w:val="0084311A"/>
     <w:rsid w:val="00844EC5"/>
     <w:rsid w:val="008F78C6"/>
     <w:rsid w:val="009179E6"/>
@@ -2825,6 +2745,7 @@
     <w:rsid w:val="00BA30D1"/>
     <w:rsid w:val="00C2422B"/>
     <w:rsid w:val="00CE5B30"/>
+    <w:rsid w:val="00E17D8A"/>
     <w:rsid w:val="00EB232B"/>
     <w:rsid w:val="00EC18E4"/>
   </w:rsids>
@@ -2841,7 +2762,7 @@
     <m:intLim m:val="subSup"/>
     <m:naryLim m:val="undOvr"/>
   </m:mathPr>
-  <w:themeFontLang w:val="en-US"/>
+  <w:themeFontLang w:val="en-US" w:bidi="ar-SA"/>
   <w:clrSchemeMapping w:bg1="light1" w:t1="dark1" w:bg2="light2" w:t2="dark2" w:accent1="accent1" w:accent2="accent2" w:accent3="accent3" w:accent4="accent4" w:accent5="accent5" w:accent6="accent6" w:hyperlink="hyperlink" w:followedHyperlink="followedHyperlink"/>
   <w:decimalSymbol w:val="."/>
   <w:listSeparator w:val=","/>
@@ -3516,6 +3437,30 @@
 </file>
 
 <file path=customXml/item2.xml><?xml version="1.0" encoding="utf-8"?>
+<p:properties xmlns:p="http://schemas.microsoft.com/office/2006/metadata/properties" xmlns:xsi="http://www.w3.org/2001/XMLSchema-instance" xmlns:pc="http://schemas.microsoft.com/office/infopath/2007/PartnerControls">
+  <documentManagement>
+    <_ip_UnifiedCompliancePolicyUIAction xmlns="http://schemas.microsoft.com/sharepoint/v3" xsi:nil="true"/>
+    <Image xmlns="71af3243-3dd4-4a8d-8c0d-dd76da1f02a5">
+      <Url xsi:nil="true"/>
+      <Description xsi:nil="true"/>
+    </Image>
+    <Status xmlns="71af3243-3dd4-4a8d-8c0d-dd76da1f02a5">Not started</Status>
+    <Background xmlns="71af3243-3dd4-4a8d-8c0d-dd76da1f02a5">false</Background>
+    <_ip_UnifiedCompliancePolicyProperties xmlns="http://schemas.microsoft.com/sharepoint/v3" xsi:nil="true"/>
+    <ImageTagsTaxHTField xmlns="71af3243-3dd4-4a8d-8c0d-dd76da1f02a5">
+      <Terms xmlns="http://schemas.microsoft.com/office/infopath/2007/PartnerControls"/>
+    </ImageTagsTaxHTField>
+    <TaxCatchAll xmlns="230e9df3-be65-4c73-a93b-d1236ebd677e" xsi:nil="true"/>
+    <MediaServiceKeyPoints xmlns="71af3243-3dd4-4a8d-8c0d-dd76da1f02a5" xsi:nil="true"/>
+  </documentManagement>
+</p:properties>
+</file>
+
+<file path=customXml/item3.xml><?xml version="1.0" encoding="utf-8"?>
+<b:Sources xmlns:b="http://schemas.openxmlformats.org/officeDocument/2006/bibliography" xmlns="http://schemas.openxmlformats.org/officeDocument/2006/bibliography" SelectedStyle="\APASixthEditionOfficeOnline.xsl" StyleName="APA" Version="6"/>
+</file>
+
+<file path=customXml/item4.xml><?xml version="1.0" encoding="utf-8"?>
 <ct:contentTypeSchema xmlns:ct="http://schemas.microsoft.com/office/2006/metadata/contentType" xmlns:ma="http://schemas.microsoft.com/office/2006/metadata/properties/metaAttributes" ct:_="" ma:_="" ma:contentTypeName="Document" ma:contentTypeID="0x01010079F111ED35F8CC479449609E8A0923A6" ma:contentTypeVersion="26" ma:contentTypeDescription="Create a new document." ma:contentTypeScope="" ma:versionID="ac37c1753acd5e330d2062ccec26ea66">
   <xsd:schema xmlns:xsd="http://www.w3.org/2001/XMLSchema" xmlns:xs="http://www.w3.org/2001/XMLSchema" xmlns:p="http://schemas.microsoft.com/office/2006/metadata/properties" xmlns:ns1="http://schemas.microsoft.com/sharepoint/v3" xmlns:ns2="71af3243-3dd4-4a8d-8c0d-dd76da1f02a5" xmlns:ns3="16c05727-aa75-4e4a-9b5f-8a80a1165891" xmlns:ns4="230e9df3-be65-4c73-a93b-d1236ebd677e" targetNamespace="http://schemas.microsoft.com/office/2006/metadata/properties" ma:root="true" ma:fieldsID="3b340c7101c92c5120abd06486f94548" ns1:_="" ns2:_="" ns3:_="" ns4:_="">
     <xsd:import namespace="http://schemas.microsoft.com/sharepoint/v3"/>
@@ -3815,30 +3760,6 @@
 </ct:contentTypeSchema>
 </file>
 
-<file path=customXml/item3.xml><?xml version="1.0" encoding="utf-8"?>
-<b:Sources xmlns:b="http://schemas.openxmlformats.org/officeDocument/2006/bibliography" xmlns="http://schemas.openxmlformats.org/officeDocument/2006/bibliography" SelectedStyle="\APASixthEditionOfficeOnline.xsl" StyleName="APA" Version="6"/>
-</file>
-
-<file path=customXml/item4.xml><?xml version="1.0" encoding="utf-8"?>
-<p:properties xmlns:p="http://schemas.microsoft.com/office/2006/metadata/properties" xmlns:xsi="http://www.w3.org/2001/XMLSchema-instance" xmlns:pc="http://schemas.microsoft.com/office/infopath/2007/PartnerControls">
-  <documentManagement>
-    <_ip_UnifiedCompliancePolicyUIAction xmlns="http://schemas.microsoft.com/sharepoint/v3" xsi:nil="true"/>
-    <Image xmlns="71af3243-3dd4-4a8d-8c0d-dd76da1f02a5">
-      <Url xsi:nil="true"/>
-      <Description xsi:nil="true"/>
-    </Image>
-    <Status xmlns="71af3243-3dd4-4a8d-8c0d-dd76da1f02a5">Not started</Status>
-    <Background xmlns="71af3243-3dd4-4a8d-8c0d-dd76da1f02a5">false</Background>
-    <_ip_UnifiedCompliancePolicyProperties xmlns="http://schemas.microsoft.com/sharepoint/v3" xsi:nil="true"/>
-    <ImageTagsTaxHTField xmlns="71af3243-3dd4-4a8d-8c0d-dd76da1f02a5">
-      <Terms xmlns="http://schemas.microsoft.com/office/infopath/2007/PartnerControls"/>
-    </ImageTagsTaxHTField>
-    <TaxCatchAll xmlns="230e9df3-be65-4c73-a93b-d1236ebd677e" xsi:nil="true"/>
-    <MediaServiceKeyPoints xmlns="71af3243-3dd4-4a8d-8c0d-dd76da1f02a5" xsi:nil="true"/>
-  </documentManagement>
-</p:properties>
-</file>
-
 <file path=customXml/itemProps1.xml><?xml version="1.0" encoding="utf-8"?>
 <ds:datastoreItem xmlns:ds="http://schemas.openxmlformats.org/officeDocument/2006/customXml" ds:itemID="{D95D051E-74B2-4F71-8CD0-B83BDE55FDD6}">
   <ds:schemaRefs>
@@ -3848,6 +3769,26 @@
 </file>
 
 <file path=customXml/itemProps2.xml><?xml version="1.0" encoding="utf-8"?>
+<ds:datastoreItem xmlns:ds="http://schemas.openxmlformats.org/officeDocument/2006/customXml" ds:itemID="{722DE524-AC56-48EF-882D-3FDD18569BE6}">
+  <ds:schemaRefs>
+    <ds:schemaRef ds:uri="http://schemas.microsoft.com/office/2006/metadata/properties"/>
+    <ds:schemaRef ds:uri="http://schemas.microsoft.com/office/infopath/2007/PartnerControls"/>
+    <ds:schemaRef ds:uri="http://schemas.microsoft.com/sharepoint/v3"/>
+    <ds:schemaRef ds:uri="71af3243-3dd4-4a8d-8c0d-dd76da1f02a5"/>
+    <ds:schemaRef ds:uri="230e9df3-be65-4c73-a93b-d1236ebd677e"/>
+  </ds:schemaRefs>
+</ds:datastoreItem>
+</file>
+
+<file path=customXml/itemProps3.xml><?xml version="1.0" encoding="utf-8"?>
+<ds:datastoreItem xmlns:ds="http://schemas.openxmlformats.org/officeDocument/2006/customXml" ds:itemID="{78FA981C-BE99-432B-93F3-0A6ADC40E2FF}">
+  <ds:schemaRefs>
+    <ds:schemaRef ds:uri="http://schemas.openxmlformats.org/officeDocument/2006/bibliography"/>
+  </ds:schemaRefs>
+</ds:datastoreItem>
+</file>
+
+<file path=customXml/itemProps4.xml><?xml version="1.0" encoding="utf-8"?>
 <ds:datastoreItem xmlns:ds="http://schemas.openxmlformats.org/officeDocument/2006/customXml" ds:itemID="{0F3A22EC-1F5D-486B-975E-D05DA5437A4D}">
   <ds:schemaRefs>
     <ds:schemaRef ds:uri="http://schemas.microsoft.com/office/2006/metadata/contentType"/>
@@ -3868,26 +3809,6 @@
 </ds:datastoreItem>
 </file>
 
-<file path=customXml/itemProps3.xml><?xml version="1.0" encoding="utf-8"?>
-<ds:datastoreItem xmlns:ds="http://schemas.openxmlformats.org/officeDocument/2006/customXml" ds:itemID="{78FA981C-BE99-432B-93F3-0A6ADC40E2FF}">
-  <ds:schemaRefs>
-    <ds:schemaRef ds:uri="http://schemas.openxmlformats.org/officeDocument/2006/bibliography"/>
-  </ds:schemaRefs>
-</ds:datastoreItem>
-</file>
-
-<file path=customXml/itemProps4.xml><?xml version="1.0" encoding="utf-8"?>
-<ds:datastoreItem xmlns:ds="http://schemas.openxmlformats.org/officeDocument/2006/customXml" ds:itemID="{722DE524-AC56-48EF-882D-3FDD18569BE6}">
-  <ds:schemaRefs>
-    <ds:schemaRef ds:uri="http://schemas.microsoft.com/office/2006/metadata/properties"/>
-    <ds:schemaRef ds:uri="http://schemas.microsoft.com/office/infopath/2007/PartnerControls"/>
-    <ds:schemaRef ds:uri="http://schemas.microsoft.com/sharepoint/v3"/>
-    <ds:schemaRef ds:uri="71af3243-3dd4-4a8d-8c0d-dd76da1f02a5"/>
-    <ds:schemaRef ds:uri="230e9df3-be65-4c73-a93b-d1236ebd677e"/>
-  </ds:schemaRefs>
-</ds:datastoreItem>
-</file>
-
 <file path=docMetadata/LabelInfo.xml><?xml version="1.0" encoding="utf-8"?>
 <clbl:labelList xmlns:clbl="http://schemas.microsoft.com/office/2020/mipLabelMetadata"/>
 </file>
</xml_diff>